<commit_message>
feat(ui): enhance layout, add theme context and polish styling
</commit_message>
<xml_diff>
--- a/План проекта.docx
+++ b/План проекта.docx
@@ -2149,7 +2149,7 @@
     <w:p>
       <w:pPr>
         <w:rPr>
-          <w:lang w:val="ru-RU"/>
+          <w:lang w:val="en-US"/>
         </w:rPr>
       </w:pPr>
       <w:r>
@@ -2168,9 +2168,19 @@
           <w:numId w:val="18"/>
         </w:numPr>
       </w:pPr>
-      <w:r>
-        <w:t>Контактная информация</w:t>
-      </w:r>
+      <w:proofErr w:type="spellStart"/>
+      <w:r>
+        <w:t>Контактная</w:t>
+      </w:r>
+      <w:proofErr w:type="spellEnd"/>
+      <w:r>
+        <w:t xml:space="preserve"> </w:t>
+      </w:r>
+      <w:proofErr w:type="spellStart"/>
+      <w:r>
+        <w:t>информация</w:t>
+      </w:r>
+      <w:proofErr w:type="spellEnd"/>
     </w:p>
     <w:p>
       <w:pPr>
@@ -2911,9 +2921,127 @@
     <w:p>
       <w:pPr>
         <w:rPr>
-          <w:lang w:val="ru-RU"/>
-        </w:rPr>
-      </w:pPr>
+          <w:lang w:val="en-US"/>
+        </w:rPr>
+      </w:pPr>
+    </w:p>
+    <w:p>
+      <w:pPr>
+        <w:rPr>
+          <w:lang w:val="en-US"/>
+        </w:rPr>
+      </w:pPr>
+    </w:p>
+    <w:p>
+      <w:pPr>
+        <w:rPr>
+          <w:lang w:val="en-US"/>
+        </w:rPr>
+      </w:pPr>
+    </w:p>
+    <w:p>
+      <w:pPr>
+        <w:rPr>
+          <w:lang w:val="en-US"/>
+        </w:rPr>
+      </w:pPr>
+      <w:r>
+        <w:rPr>
+          <w:lang w:val="ru-RU"/>
+        </w:rPr>
+        <w:t xml:space="preserve">Я реализовала имитацию </w:t>
+      </w:r>
+      <w:r>
+        <w:t>REST</w:t>
+      </w:r>
+      <w:r>
+        <w:rPr>
+          <w:lang w:val="ru-RU"/>
+        </w:rPr>
+        <w:t xml:space="preserve"> </w:t>
+      </w:r>
+      <w:r>
+        <w:t>API</w:t>
+      </w:r>
+      <w:r>
+        <w:rPr>
+          <w:lang w:val="ru-RU"/>
+        </w:rPr>
+        <w:t xml:space="preserve"> через сервисный слой и использовала </w:t>
+      </w:r>
+      <w:proofErr w:type="spellStart"/>
+      <w:r>
+        <w:t>useEffect</w:t>
+      </w:r>
+      <w:proofErr w:type="spellEnd"/>
+      <w:r>
+        <w:rPr>
+          <w:lang w:val="ru-RU"/>
+        </w:rPr>
+        <w:t xml:space="preserve"> для загрузки данных.</w:t>
+      </w:r>
+    </w:p>
+    <w:p>
+      <w:pPr>
+        <w:rPr>
+          <w:lang w:val="ru-RU"/>
+        </w:rPr>
+      </w:pPr>
+      <w:r>
+        <w:rPr>
+          <w:lang w:val="ru-RU"/>
+        </w:rPr>
+        <w:t xml:space="preserve">Я реализовала глобальное состояние темы через </w:t>
+      </w:r>
+      <w:r>
+        <w:t>Context</w:t>
+      </w:r>
+      <w:r>
+        <w:rPr>
+          <w:lang w:val="ru-RU"/>
+        </w:rPr>
+        <w:t xml:space="preserve"> </w:t>
+      </w:r>
+      <w:r>
+        <w:t>API</w:t>
+      </w:r>
+      <w:r>
+        <w:rPr>
+          <w:lang w:val="ru-RU"/>
+        </w:rPr>
+        <w:t xml:space="preserve">, использовала </w:t>
+      </w:r>
+      <w:proofErr w:type="spellStart"/>
+      <w:r>
+        <w:t>useEffect</w:t>
+      </w:r>
+      <w:proofErr w:type="spellEnd"/>
+      <w:r>
+        <w:rPr>
+          <w:lang w:val="ru-RU"/>
+        </w:rPr>
+        <w:t xml:space="preserve"> для синхронизации с </w:t>
+      </w:r>
+      <w:r>
+        <w:t>DOM</w:t>
+      </w:r>
+      <w:r>
+        <w:rPr>
+          <w:lang w:val="ru-RU"/>
+        </w:rPr>
+        <w:t xml:space="preserve"> и </w:t>
+      </w:r>
+      <w:proofErr w:type="spellStart"/>
+      <w:r>
+        <w:t>localStorage</w:t>
+      </w:r>
+      <w:proofErr w:type="spellEnd"/>
+      <w:r>
+        <w:rPr>
+          <w:lang w:val="ru-RU"/>
+        </w:rPr>
+        <w:t>.</w:t>
+      </w:r>
     </w:p>
     <w:sectPr>
       <w:pgSz w:w="11906" w:h="16838"/>

</xml_diff>

<commit_message>
chore: complete project implementation, fix layout and accessibility issues
</commit_message>
<xml_diff>
--- a/План проекта.docx
+++ b/План проекта.docx
@@ -1419,1628 +1419,6 @@
       </w:pPr>
       <w:r>
         <w:t xml:space="preserve"> └─ main.tsx</w:t>
-      </w:r>
-    </w:p>
-    <w:p>
-      <w:pPr>
-        <w:rPr>
-          <w:b/>
-          <w:bCs/>
-          <w:lang w:val="ru-RU"/>
-        </w:rPr>
-      </w:pPr>
-      <w:r>
-        <w:rPr>
-          <w:b/>
-          <w:bCs/>
-          <w:lang w:val="ru-RU"/>
-        </w:rPr>
-        <w:t xml:space="preserve">7. </w:t>
-      </w:r>
-      <w:r>
-        <w:rPr>
-          <w:b/>
-          <w:bCs/>
-        </w:rPr>
-        <w:t>GITHUB</w:t>
-      </w:r>
-      <w:r>
-        <w:rPr>
-          <w:b/>
-          <w:bCs/>
-          <w:lang w:val="ru-RU"/>
-        </w:rPr>
-        <w:t xml:space="preserve"> </w:t>
-      </w:r>
-    </w:p>
-    <w:p>
-      <w:pPr>
-        <w:rPr>
-          <w:lang w:val="ru-RU"/>
-        </w:rPr>
-      </w:pPr>
-      <w:r>
-        <w:rPr>
-          <w:lang w:val="ru-RU"/>
-        </w:rPr>
-        <w:t xml:space="preserve">Минимум </w:t>
-      </w:r>
-      <w:r>
-        <w:rPr>
-          <w:b/>
-          <w:bCs/>
-          <w:lang w:val="ru-RU"/>
-        </w:rPr>
-        <w:t>3 коммита</w:t>
-      </w:r>
-      <w:r>
-        <w:rPr>
-          <w:lang w:val="ru-RU"/>
-        </w:rPr>
-        <w:t>:</w:t>
-      </w:r>
-    </w:p>
-    <w:p>
-      <w:pPr>
-        <w:numPr>
-          <w:ilvl w:val="0"/>
-          <w:numId w:val="11"/>
-        </w:numPr>
-      </w:pPr>
-      <w:r>
-        <w:t>init project structure</w:t>
-      </w:r>
-    </w:p>
-    <w:p>
-      <w:pPr>
-        <w:numPr>
-          <w:ilvl w:val="0"/>
-          <w:numId w:val="11"/>
-        </w:numPr>
-      </w:pPr>
-      <w:r>
-        <w:t>adaptive layout and navigation</w:t>
-      </w:r>
-    </w:p>
-    <w:p>
-      <w:pPr>
-        <w:numPr>
-          <w:ilvl w:val="0"/>
-          <w:numId w:val="11"/>
-        </w:numPr>
-      </w:pPr>
-      <w:r>
-        <w:t>add functionality and api integration</w:t>
-      </w:r>
-    </w:p>
-    <w:p>
-      <w:pPr>
-        <w:rPr>
-          <w:b/>
-          <w:bCs/>
-          <w:lang w:val="ru-RU"/>
-        </w:rPr>
-      </w:pPr>
-    </w:p>
-    <w:p>
-      <w:pPr>
-        <w:rPr>
-          <w:b/>
-          <w:bCs/>
-          <w:lang w:val="ru-RU"/>
-        </w:rPr>
-      </w:pPr>
-      <w:r>
-        <w:rPr>
-          <w:b/>
-          <w:bCs/>
-          <w:lang w:val="ru-RU"/>
-        </w:rPr>
-        <w:lastRenderedPageBreak/>
-        <w:t>План выполнения финального проекта</w:t>
-      </w:r>
-    </w:p>
-    <w:p>
-      <w:pPr>
-        <w:rPr>
-          <w:lang w:val="en-US"/>
-        </w:rPr>
-      </w:pPr>
-      <w:r>
-        <w:rPr>
-          <w:b/>
-          <w:bCs/>
-          <w:lang w:val="ru-RU"/>
-        </w:rPr>
-        <w:t>Период: с 16 февраля по 5 марта</w:t>
-      </w:r>
-    </w:p>
-    <w:p>
-      <w:pPr>
-        <w:rPr>
-          <w:b/>
-          <w:bCs/>
-        </w:rPr>
-      </w:pPr>
-      <w:r>
-        <w:rPr>
-          <w:b/>
-          <w:bCs/>
-        </w:rPr>
-        <w:t>16 февраля — День 1</w:t>
-      </w:r>
-      <w:r>
-        <w:rPr>
-          <w:b/>
-          <w:bCs/>
-        </w:rPr>
-        <w:t>+</w:t>
-      </w:r>
-    </w:p>
-    <w:p>
-      <w:r>
-        <w:rPr>
-          <w:b/>
-          <w:bCs/>
-        </w:rPr>
-        <w:t>Подготовительный этап</w:t>
-      </w:r>
-    </w:p>
-    <w:p>
-      <w:pPr>
-        <w:numPr>
-          <w:ilvl w:val="0"/>
-          <w:numId w:val="12"/>
-        </w:numPr>
-      </w:pPr>
-      <w:r>
-        <w:t>Окончательный выбор темы проекта</w:t>
-      </w:r>
-    </w:p>
-    <w:p>
-      <w:pPr>
-        <w:numPr>
-          <w:ilvl w:val="0"/>
-          <w:numId w:val="12"/>
-        </w:numPr>
-        <w:rPr>
-          <w:lang w:val="ru-RU"/>
-        </w:rPr>
-      </w:pPr>
-      <w:r>
-        <w:rPr>
-          <w:lang w:val="ru-RU"/>
-        </w:rPr>
-        <w:t>Утверждение идеи сайта школы английского языка</w:t>
-      </w:r>
-    </w:p>
-    <w:p>
-      <w:pPr>
-        <w:numPr>
-          <w:ilvl w:val="0"/>
-          <w:numId w:val="12"/>
-        </w:numPr>
-      </w:pPr>
-      <w:r>
-        <w:t>Анализ требований финального задания</w:t>
-      </w:r>
-    </w:p>
-    <w:p>
-      <w:pPr>
-        <w:numPr>
-          <w:ilvl w:val="0"/>
-          <w:numId w:val="12"/>
-        </w:numPr>
-      </w:pPr>
-      <w:r>
-        <w:t>Подбор и утверждение дизайн-макета</w:t>
-      </w:r>
-    </w:p>
-    <w:p>
-      <w:pPr>
-        <w:numPr>
-          <w:ilvl w:val="0"/>
-          <w:numId w:val="12"/>
-        </w:numPr>
-      </w:pPr>
-      <w:r>
-        <w:t>Создание GitHub-репозитория</w:t>
-      </w:r>
-    </w:p>
-    <w:p>
-      <w:pPr>
-        <w:rPr>
-          <w:lang w:val="ru-RU"/>
-        </w:rPr>
-      </w:pPr>
-      <w:r>
-        <w:rPr>
-          <w:lang w:val="ru-RU"/>
-        </w:rPr>
-        <w:t>Результат дня: утверждённая тема, макет, пустой репозиторий</w:t>
-      </w:r>
-    </w:p>
-    <w:p>
-      <w:pPr>
-        <w:rPr>
-          <w:b/>
-          <w:bCs/>
-        </w:rPr>
-      </w:pPr>
-      <w:r>
-        <w:rPr>
-          <w:b/>
-          <w:bCs/>
-        </w:rPr>
-        <w:t>17 февраля — День 2</w:t>
-      </w:r>
-      <w:r>
-        <w:rPr>
-          <w:b/>
-          <w:bCs/>
-        </w:rPr>
-        <w:t>+</w:t>
-      </w:r>
-    </w:p>
-    <w:p>
-      <w:r>
-        <w:rPr>
-          <w:b/>
-          <w:bCs/>
-        </w:rPr>
-        <w:t>Инициализация проекта</w:t>
-      </w:r>
-    </w:p>
-    <w:p>
-      <w:pPr>
-        <w:numPr>
-          <w:ilvl w:val="0"/>
-          <w:numId w:val="13"/>
-        </w:numPr>
-        <w:rPr>
-          <w:lang w:val="ru-RU"/>
-        </w:rPr>
-      </w:pPr>
-      <w:r>
-        <w:rPr>
-          <w:lang w:val="ru-RU"/>
-        </w:rPr>
-        <w:t xml:space="preserve">Создание </w:t>
-      </w:r>
-      <w:r>
-        <w:t>React</w:t>
-      </w:r>
-      <w:r>
-        <w:rPr>
-          <w:lang w:val="ru-RU"/>
-        </w:rPr>
-        <w:t>-проекта (</w:t>
-      </w:r>
-      <w:r>
-        <w:t>CRA</w:t>
-      </w:r>
-      <w:r>
-        <w:rPr>
-          <w:lang w:val="ru-RU"/>
-        </w:rPr>
-        <w:t xml:space="preserve"> или </w:t>
-      </w:r>
-      <w:r>
-        <w:t>Vite</w:t>
-      </w:r>
-      <w:r>
-        <w:rPr>
-          <w:lang w:val="ru-RU"/>
-        </w:rPr>
-        <w:t>)</w:t>
-      </w:r>
-    </w:p>
-    <w:p>
-      <w:pPr>
-        <w:numPr>
-          <w:ilvl w:val="0"/>
-          <w:numId w:val="13"/>
-        </w:numPr>
-      </w:pPr>
-      <w:r>
-        <w:t>Подключение TypeScript</w:t>
-      </w:r>
-    </w:p>
-    <w:p>
-      <w:pPr>
-        <w:numPr>
-          <w:ilvl w:val="0"/>
-          <w:numId w:val="13"/>
-        </w:numPr>
-      </w:pPr>
-      <w:r>
-        <w:t>Настройка базовой структуры проекта</w:t>
-      </w:r>
-    </w:p>
-    <w:p>
-      <w:pPr>
-        <w:numPr>
-          <w:ilvl w:val="0"/>
-          <w:numId w:val="13"/>
-        </w:numPr>
-      </w:pPr>
-      <w:r>
-        <w:t>Установка React Router</w:t>
-      </w:r>
-    </w:p>
-    <w:p>
-      <w:pPr>
-        <w:numPr>
-          <w:ilvl w:val="0"/>
-          <w:numId w:val="13"/>
-        </w:numPr>
-      </w:pPr>
-      <w:r>
-        <w:t>Создание базовых страниц (заглушки)</w:t>
-      </w:r>
-    </w:p>
-    <w:p>
-      <w:pPr>
-        <w:rPr>
-          <w:lang w:val="ru-RU"/>
-        </w:rPr>
-      </w:pPr>
-      <w:r>
-        <w:t xml:space="preserve"> Первый коммит: init project structure</w:t>
-      </w:r>
-    </w:p>
-    <w:p>
-      <w:pPr>
-        <w:rPr>
-          <w:b/>
-          <w:bCs/>
-          <w:lang w:val="en-US"/>
-        </w:rPr>
-      </w:pPr>
-      <w:r>
-        <w:rPr>
-          <w:b/>
-          <w:bCs/>
-          <w:lang w:val="ru-RU"/>
-        </w:rPr>
-        <w:t>18 февраля — День 3</w:t>
-      </w:r>
-      <w:r>
-        <w:rPr>
-          <w:b/>
-          <w:bCs/>
-          <w:lang w:val="en-US"/>
-        </w:rPr>
-        <w:t>+</w:t>
-      </w:r>
-    </w:p>
-    <w:p>
-      <w:pPr>
-        <w:rPr>
-          <w:lang w:val="ru-RU"/>
-        </w:rPr>
-      </w:pPr>
-      <w:r>
-        <w:rPr>
-          <w:b/>
-          <w:bCs/>
-          <w:lang w:val="ru-RU"/>
-        </w:rPr>
-        <w:t>Верстка: шапка и навигация</w:t>
-      </w:r>
-    </w:p>
-    <w:p>
-      <w:pPr>
-        <w:numPr>
-          <w:ilvl w:val="0"/>
-          <w:numId w:val="14"/>
-        </w:numPr>
-      </w:pPr>
-      <w:r>
-        <w:t>Верстка Header</w:t>
-      </w:r>
-    </w:p>
-    <w:p>
-      <w:pPr>
-        <w:numPr>
-          <w:ilvl w:val="0"/>
-          <w:numId w:val="14"/>
-        </w:numPr>
-      </w:pPr>
-      <w:r>
-        <w:t>Реализация навигационного меню</w:t>
-      </w:r>
-    </w:p>
-    <w:p>
-      <w:pPr>
-        <w:numPr>
-          <w:ilvl w:val="0"/>
-          <w:numId w:val="14"/>
-        </w:numPr>
-        <w:rPr>
-          <w:lang w:val="ru-RU"/>
-        </w:rPr>
-      </w:pPr>
-      <w:r>
-        <w:rPr>
-          <w:lang w:val="ru-RU"/>
-        </w:rPr>
-        <w:t>Адаптивная навигация (бургер-меню &lt; 1024</w:t>
-      </w:r>
-      <w:r>
-        <w:t>px</w:t>
-      </w:r>
-      <w:r>
-        <w:rPr>
-          <w:lang w:val="ru-RU"/>
-        </w:rPr>
-        <w:t>)</w:t>
-      </w:r>
-    </w:p>
-    <w:p>
-      <w:pPr>
-        <w:numPr>
-          <w:ilvl w:val="0"/>
-          <w:numId w:val="14"/>
-        </w:numPr>
-      </w:pPr>
-      <w:r>
-        <w:t>Подключение маршрутизации</w:t>
-      </w:r>
-    </w:p>
-    <w:p>
-      <w:r>
-        <w:rPr>
-          <w:lang w:val="ru-RU"/>
-        </w:rPr>
-        <w:t xml:space="preserve"> Проверка адаптива на разных разрешениях</w:t>
-      </w:r>
-    </w:p>
-    <w:p>
-      <w:pPr>
-        <w:rPr>
-          <w:b/>
-          <w:bCs/>
-          <w:lang w:val="ru-RU"/>
-        </w:rPr>
-      </w:pPr>
-      <w:r>
-        <w:rPr>
-          <w:b/>
-          <w:bCs/>
-          <w:lang w:val="ru-RU"/>
-        </w:rPr>
-        <w:t>19 февраля — День 4</w:t>
-      </w:r>
-    </w:p>
-    <w:p>
-      <w:pPr>
-        <w:rPr>
-          <w:lang w:val="ru-RU"/>
-        </w:rPr>
-      </w:pPr>
-      <w:r>
-        <w:rPr>
-          <w:b/>
-          <w:bCs/>
-          <w:lang w:val="ru-RU"/>
-        </w:rPr>
-        <w:t>Верстка: подвал и главная страница</w:t>
-      </w:r>
-    </w:p>
-    <w:p>
-      <w:pPr>
-        <w:numPr>
-          <w:ilvl w:val="0"/>
-          <w:numId w:val="15"/>
-        </w:numPr>
-      </w:pPr>
-      <w:r>
-        <w:t>Верстка Footer</w:t>
-      </w:r>
-    </w:p>
-    <w:p>
-      <w:pPr>
-        <w:numPr>
-          <w:ilvl w:val="0"/>
-          <w:numId w:val="15"/>
-        </w:numPr>
-      </w:pPr>
-      <w:r>
-        <w:t>Верстка страницы «О школе»</w:t>
-      </w:r>
-    </w:p>
-    <w:p>
-      <w:pPr>
-        <w:numPr>
-          <w:ilvl w:val="0"/>
-          <w:numId w:val="15"/>
-        </w:numPr>
-      </w:pPr>
-      <w:r>
-        <w:lastRenderedPageBreak/>
-        <w:t>Использование Flexbox</w:t>
-      </w:r>
-    </w:p>
-    <w:p>
-      <w:pPr>
-        <w:numPr>
-          <w:ilvl w:val="0"/>
-          <w:numId w:val="15"/>
-        </w:numPr>
-      </w:pPr>
-      <w:r>
-        <w:t>Адаптация под мобильные экраны</w:t>
-      </w:r>
-    </w:p>
-    <w:p>
-      <w:pPr>
-        <w:rPr>
-          <w:b/>
-          <w:bCs/>
-          <w:lang w:val="ru-RU"/>
-        </w:rPr>
-      </w:pPr>
-      <w:r>
-        <w:rPr>
-          <w:b/>
-          <w:bCs/>
-          <w:lang w:val="ru-RU"/>
-        </w:rPr>
-        <w:t>20 февраля — День 5</w:t>
-      </w:r>
-    </w:p>
-    <w:p>
-      <w:pPr>
-        <w:rPr>
-          <w:lang w:val="ru-RU"/>
-        </w:rPr>
-      </w:pPr>
-      <w:r>
-        <w:rPr>
-          <w:b/>
-          <w:bCs/>
-          <w:lang w:val="ru-RU"/>
-        </w:rPr>
-        <w:t>Верстка страницы «Обучение / Курсы»</w:t>
-      </w:r>
-    </w:p>
-    <w:p>
-      <w:pPr>
-        <w:numPr>
-          <w:ilvl w:val="0"/>
-          <w:numId w:val="16"/>
-        </w:numPr>
-      </w:pPr>
-      <w:r>
-        <w:t>Создание карточек курсов</w:t>
-      </w:r>
-    </w:p>
-    <w:p>
-      <w:pPr>
-        <w:numPr>
-          <w:ilvl w:val="0"/>
-          <w:numId w:val="16"/>
-        </w:numPr>
-      </w:pPr>
-      <w:r>
-        <w:t>Адаптивная сетка</w:t>
-      </w:r>
-    </w:p>
-    <w:p>
-      <w:pPr>
-        <w:numPr>
-          <w:ilvl w:val="0"/>
-          <w:numId w:val="16"/>
-        </w:numPr>
-        <w:rPr>
-          <w:lang w:val="ru-RU"/>
-        </w:rPr>
-      </w:pPr>
-      <w:r>
-        <w:rPr>
-          <w:lang w:val="ru-RU"/>
-        </w:rPr>
-        <w:t>Подготовка данных курсов (мок-данные)</w:t>
-      </w:r>
-    </w:p>
-    <w:p>
-      <w:r>
-        <w:t>Коммит: add adaptive layout for main pages</w:t>
-      </w:r>
-    </w:p>
-    <w:p>
-      <w:pPr>
-        <w:rPr>
-          <w:b/>
-          <w:bCs/>
-          <w:lang w:val="ru-RU"/>
-        </w:rPr>
-      </w:pPr>
-      <w:r>
-        <w:rPr>
-          <w:b/>
-          <w:bCs/>
-          <w:lang w:val="ru-RU"/>
-        </w:rPr>
-        <w:t>21 февраля — День 6</w:t>
-      </w:r>
-    </w:p>
-    <w:p>
-      <w:pPr>
-        <w:rPr>
-          <w:lang w:val="ru-RU"/>
-        </w:rPr>
-      </w:pPr>
-      <w:r>
-        <w:rPr>
-          <w:b/>
-          <w:bCs/>
-          <w:lang w:val="ru-RU"/>
-        </w:rPr>
-        <w:t>Верстка страницы «Вопросы (</w:t>
-      </w:r>
-      <w:r>
-        <w:rPr>
-          <w:b/>
-          <w:bCs/>
-        </w:rPr>
-        <w:t>FAQ</w:t>
-      </w:r>
-      <w:r>
-        <w:rPr>
-          <w:b/>
-          <w:bCs/>
-          <w:lang w:val="ru-RU"/>
-        </w:rPr>
-        <w:t>)»</w:t>
-      </w:r>
-    </w:p>
-    <w:p>
-      <w:pPr>
-        <w:numPr>
-          <w:ilvl w:val="0"/>
-          <w:numId w:val="17"/>
-        </w:numPr>
-      </w:pPr>
-      <w:r>
-        <w:t>Реализация аккордеона</w:t>
-      </w:r>
-    </w:p>
-    <w:p>
-      <w:pPr>
-        <w:numPr>
-          <w:ilvl w:val="0"/>
-          <w:numId w:val="17"/>
-        </w:numPr>
-      </w:pPr>
-      <w:r>
-        <w:t>Адаптация под мобильные устройства</w:t>
-      </w:r>
-    </w:p>
-    <w:p>
-      <w:pPr>
-        <w:numPr>
-          <w:ilvl w:val="0"/>
-          <w:numId w:val="17"/>
-        </w:numPr>
-      </w:pPr>
-      <w:r>
-        <w:t>Проверка доступности (клики, отступы)</w:t>
-      </w:r>
-    </w:p>
-    <w:p>
-      <w:pPr>
-        <w:rPr>
-          <w:b/>
-          <w:bCs/>
-          <w:lang w:val="ru-RU"/>
-        </w:rPr>
-      </w:pPr>
-      <w:r>
-        <w:rPr>
-          <w:b/>
-          <w:bCs/>
-          <w:lang w:val="ru-RU"/>
-        </w:rPr>
-        <w:t>22 февраля — День 7</w:t>
-      </w:r>
-    </w:p>
-    <w:p>
-      <w:pPr>
-        <w:rPr>
-          <w:lang w:val="en-US"/>
-        </w:rPr>
-      </w:pPr>
-      <w:r>
-        <w:rPr>
-          <w:b/>
-          <w:bCs/>
-          <w:lang w:val="ru-RU"/>
-        </w:rPr>
-        <w:t>Верстка страницы «Контакты»</w:t>
-      </w:r>
-    </w:p>
-    <w:p>
-      <w:pPr>
-        <w:numPr>
-          <w:ilvl w:val="0"/>
-          <w:numId w:val="18"/>
-        </w:numPr>
-      </w:pPr>
-      <w:proofErr w:type="spellStart"/>
-      <w:r>
-        <w:t>Контактная</w:t>
-      </w:r>
-      <w:proofErr w:type="spellEnd"/>
-      <w:r>
-        <w:t xml:space="preserve"> </w:t>
-      </w:r>
-      <w:proofErr w:type="spellStart"/>
-      <w:r>
-        <w:t>информация</w:t>
-      </w:r>
-      <w:proofErr w:type="spellEnd"/>
-    </w:p>
-    <w:p>
-      <w:pPr>
-        <w:numPr>
-          <w:ilvl w:val="0"/>
-          <w:numId w:val="18"/>
-        </w:numPr>
-      </w:pPr>
-      <w:r>
-        <w:t>Адаптивная верстка</w:t>
-      </w:r>
-    </w:p>
-    <w:p>
-      <w:pPr>
-        <w:numPr>
-          <w:ilvl w:val="0"/>
-          <w:numId w:val="18"/>
-        </w:numPr>
-      </w:pPr>
-      <w:r>
-        <w:t>Финальная проверка всех контрольных точек</w:t>
-      </w:r>
-    </w:p>
-    <w:p>
-      <w:pPr>
-        <w:rPr>
-          <w:lang w:val="ru-RU"/>
-        </w:rPr>
-      </w:pPr>
-      <w:r>
-        <w:rPr>
-          <w:lang w:val="ru-RU"/>
-        </w:rPr>
-        <w:t xml:space="preserve"> На этом этапе верстка полностью завершена </w:t>
-      </w:r>
-    </w:p>
-    <w:p>
-      <w:pPr>
-        <w:rPr>
-          <w:b/>
-          <w:bCs/>
-        </w:rPr>
-      </w:pPr>
-      <w:r>
-        <w:rPr>
-          <w:b/>
-          <w:bCs/>
-        </w:rPr>
-        <w:t>23 февраля — День 8</w:t>
-      </w:r>
-    </w:p>
-    <w:p>
-      <w:r>
-        <w:rPr>
-          <w:b/>
-          <w:bCs/>
-        </w:rPr>
-        <w:t>Форма обратной связи</w:t>
-      </w:r>
-    </w:p>
-    <w:p>
-      <w:pPr>
-        <w:numPr>
-          <w:ilvl w:val="0"/>
-          <w:numId w:val="19"/>
-        </w:numPr>
-      </w:pPr>
-      <w:r>
-        <w:t>Верстка формы «Подать заявку»</w:t>
-      </w:r>
-    </w:p>
-    <w:p>
-      <w:pPr>
-        <w:numPr>
-          <w:ilvl w:val="0"/>
-          <w:numId w:val="19"/>
-        </w:numPr>
-      </w:pPr>
-      <w:r>
-        <w:t>Валидация полей</w:t>
-      </w:r>
-    </w:p>
-    <w:p>
-      <w:pPr>
-        <w:numPr>
-          <w:ilvl w:val="0"/>
-          <w:numId w:val="19"/>
-        </w:numPr>
-      </w:pPr>
-      <w:r>
-        <w:t>Отображение ошибок</w:t>
-      </w:r>
-    </w:p>
-    <w:p>
-      <w:pPr>
-        <w:numPr>
-          <w:ilvl w:val="0"/>
-          <w:numId w:val="19"/>
-        </w:numPr>
-      </w:pPr>
-      <w:r>
-        <w:t>Подготовка к работе с localStorage</w:t>
-      </w:r>
-    </w:p>
-    <w:p>
-      <w:pPr>
-        <w:rPr>
-          <w:b/>
-          <w:bCs/>
-        </w:rPr>
-      </w:pPr>
-      <w:r>
-        <w:rPr>
-          <w:b/>
-          <w:bCs/>
-        </w:rPr>
-        <w:t>24 февраля — День 9</w:t>
-      </w:r>
-    </w:p>
-    <w:p>
-      <w:r>
-        <w:rPr>
-          <w:b/>
-          <w:bCs/>
-        </w:rPr>
-        <w:t>Работа с localStorage</w:t>
-      </w:r>
-    </w:p>
-    <w:p>
-      <w:pPr>
-        <w:numPr>
-          <w:ilvl w:val="0"/>
-          <w:numId w:val="20"/>
-        </w:numPr>
-      </w:pPr>
-      <w:r>
-        <w:t>Сохранение данных формы</w:t>
-      </w:r>
-    </w:p>
-    <w:p>
-      <w:pPr>
-        <w:numPr>
-          <w:ilvl w:val="0"/>
-          <w:numId w:val="20"/>
-        </w:numPr>
-      </w:pPr>
-      <w:r>
-        <w:t>Чтение данных из localStorage</w:t>
-      </w:r>
-    </w:p>
-    <w:p>
-      <w:pPr>
-        <w:numPr>
-          <w:ilvl w:val="0"/>
-          <w:numId w:val="20"/>
-        </w:numPr>
-      </w:pPr>
-      <w:r>
-        <w:lastRenderedPageBreak/>
-        <w:t>Сообщение об успешной отправке</w:t>
-      </w:r>
-    </w:p>
-    <w:p>
-      <w:r>
-        <w:t xml:space="preserve"> Коммит: add form and localStorage logic</w:t>
-      </w:r>
-    </w:p>
-    <w:p>
-      <w:pPr>
-        <w:rPr>
-          <w:b/>
-          <w:bCs/>
-        </w:rPr>
-      </w:pPr>
-      <w:r>
-        <w:rPr>
-          <w:b/>
-          <w:bCs/>
-        </w:rPr>
-        <w:t>25 февраля — День 10</w:t>
-      </w:r>
-    </w:p>
-    <w:p>
-      <w:r>
-        <w:rPr>
-          <w:b/>
-          <w:bCs/>
-        </w:rPr>
-        <w:t>REST API</w:t>
-      </w:r>
-    </w:p>
-    <w:p>
-      <w:pPr>
-        <w:numPr>
-          <w:ilvl w:val="0"/>
-          <w:numId w:val="21"/>
-        </w:numPr>
-      </w:pPr>
-      <w:r>
-        <w:t>Подключение публичного API (новости)</w:t>
-      </w:r>
-    </w:p>
-    <w:p>
-      <w:pPr>
-        <w:numPr>
-          <w:ilvl w:val="0"/>
-          <w:numId w:val="21"/>
-        </w:numPr>
-      </w:pPr>
-      <w:r>
-        <w:t>Загрузка данных через useEffect</w:t>
-      </w:r>
-    </w:p>
-    <w:p>
-      <w:pPr>
-        <w:numPr>
-          <w:ilvl w:val="0"/>
-          <w:numId w:val="21"/>
-        </w:numPr>
-      </w:pPr>
-      <w:r>
-        <w:t>Отображение новостей карточками</w:t>
-      </w:r>
-    </w:p>
-    <w:p>
-      <w:pPr>
-        <w:numPr>
-          <w:ilvl w:val="0"/>
-          <w:numId w:val="21"/>
-        </w:numPr>
-      </w:pPr>
-      <w:r>
-        <w:t>Обработка состояния загрузки</w:t>
-      </w:r>
-    </w:p>
-    <w:p>
-      <w:pPr>
-        <w:rPr>
-          <w:b/>
-          <w:bCs/>
-        </w:rPr>
-      </w:pPr>
-      <w:r>
-        <w:rPr>
-          <w:b/>
-          <w:bCs/>
-        </w:rPr>
-        <w:t>26 февраля — День 11</w:t>
-      </w:r>
-    </w:p>
-    <w:p>
-      <w:r>
-        <w:rPr>
-          <w:b/>
-          <w:bCs/>
-        </w:rPr>
-        <w:t>Контекст и хуки</w:t>
-      </w:r>
-    </w:p>
-    <w:p>
-      <w:pPr>
-        <w:numPr>
-          <w:ilvl w:val="0"/>
-          <w:numId w:val="22"/>
-        </w:numPr>
-      </w:pPr>
-      <w:r>
-        <w:t>Создание AppContext</w:t>
-      </w:r>
-    </w:p>
-    <w:p>
-      <w:pPr>
-        <w:numPr>
-          <w:ilvl w:val="0"/>
-          <w:numId w:val="22"/>
-        </w:numPr>
-      </w:pPr>
-      <w:r>
-        <w:t>Использование useContext</w:t>
-      </w:r>
-    </w:p>
-    <w:p>
-      <w:pPr>
-        <w:numPr>
-          <w:ilvl w:val="0"/>
-          <w:numId w:val="22"/>
-        </w:numPr>
-      </w:pPr>
-      <w:r>
-        <w:t>Оптимизация состояния приложения</w:t>
-      </w:r>
-    </w:p>
-    <w:p>
-      <w:pPr>
-        <w:rPr>
-          <w:b/>
-          <w:bCs/>
-          <w:lang w:val="ru-RU"/>
-        </w:rPr>
-      </w:pPr>
-      <w:r>
-        <w:rPr>
-          <w:b/>
-          <w:bCs/>
-          <w:lang w:val="ru-RU"/>
-        </w:rPr>
-        <w:t>27 февраля — День 12</w:t>
-      </w:r>
-    </w:p>
-    <w:p>
-      <w:pPr>
-        <w:rPr>
-          <w:lang w:val="ru-RU"/>
-        </w:rPr>
-      </w:pPr>
-      <w:r>
-        <w:rPr>
-          <w:b/>
-          <w:bCs/>
-          <w:lang w:val="ru-RU"/>
-        </w:rPr>
-        <w:t xml:space="preserve">Полировка </w:t>
-      </w:r>
-      <w:r>
-        <w:rPr>
-          <w:b/>
-          <w:bCs/>
-        </w:rPr>
-        <w:t>UI</w:t>
-      </w:r>
-      <w:r>
-        <w:rPr>
-          <w:b/>
-          <w:bCs/>
-          <w:lang w:val="ru-RU"/>
-        </w:rPr>
-        <w:t xml:space="preserve"> и </w:t>
-      </w:r>
-      <w:r>
-        <w:rPr>
-          <w:b/>
-          <w:bCs/>
-        </w:rPr>
-        <w:t>UX</w:t>
-      </w:r>
-    </w:p>
-    <w:p>
-      <w:pPr>
-        <w:numPr>
-          <w:ilvl w:val="0"/>
-          <w:numId w:val="23"/>
-        </w:numPr>
-      </w:pPr>
-      <w:r>
-        <w:t>Проверка всех сценариев</w:t>
-      </w:r>
-    </w:p>
-    <w:p>
-      <w:pPr>
-        <w:numPr>
-          <w:ilvl w:val="0"/>
-          <w:numId w:val="23"/>
-        </w:numPr>
-      </w:pPr>
-      <w:r>
-        <w:t>Исправление багов</w:t>
-      </w:r>
-    </w:p>
-    <w:p>
-      <w:pPr>
-        <w:numPr>
-          <w:ilvl w:val="0"/>
-          <w:numId w:val="23"/>
-        </w:numPr>
-      </w:pPr>
-      <w:r>
-        <w:t>Улучшение взаимодействия (hover, transitions)</w:t>
-      </w:r>
-    </w:p>
-    <w:p>
-      <w:pPr>
-        <w:rPr>
-          <w:b/>
-          <w:bCs/>
-        </w:rPr>
-      </w:pPr>
-      <w:r>
-        <w:rPr>
-          <w:b/>
-          <w:bCs/>
-        </w:rPr>
-        <w:t>28 февраля — День 13</w:t>
-      </w:r>
-    </w:p>
-    <w:p>
-      <w:r>
-        <w:rPr>
-          <w:b/>
-          <w:bCs/>
-        </w:rPr>
-        <w:t>Адаптив + кроссбраузерность</w:t>
-      </w:r>
-    </w:p>
-    <w:p>
-      <w:pPr>
-        <w:numPr>
-          <w:ilvl w:val="0"/>
-          <w:numId w:val="24"/>
-        </w:numPr>
-      </w:pPr>
-      <w:r>
-        <w:t>Финальная проверка всех разрешений</w:t>
-      </w:r>
-    </w:p>
-    <w:p>
-      <w:pPr>
-        <w:numPr>
-          <w:ilvl w:val="0"/>
-          <w:numId w:val="24"/>
-        </w:numPr>
-      </w:pPr>
-      <w:r>
-        <w:t>Тестирование в разных браузерах</w:t>
-      </w:r>
-    </w:p>
-    <w:p>
-      <w:pPr>
-        <w:numPr>
-          <w:ilvl w:val="0"/>
-          <w:numId w:val="24"/>
-        </w:numPr>
-      </w:pPr>
-      <w:r>
-        <w:t>Исправление проблем с версткой</w:t>
-      </w:r>
-    </w:p>
-    <w:p>
-      <w:r>
-        <w:t>Коммит: fix responsive and ui issues</w:t>
-      </w:r>
-    </w:p>
-    <w:p>
-      <w:pPr>
-        <w:rPr>
-          <w:b/>
-          <w:bCs/>
-        </w:rPr>
-      </w:pPr>
-      <w:r>
-        <w:rPr>
-          <w:b/>
-          <w:bCs/>
-        </w:rPr>
-        <w:t>1 марта — День 14</w:t>
-      </w:r>
-    </w:p>
-    <w:p>
-      <w:r>
-        <w:rPr>
-          <w:b/>
-          <w:bCs/>
-        </w:rPr>
-        <w:t>Рефакторинг и чистка</w:t>
-      </w:r>
-    </w:p>
-    <w:p>
-      <w:pPr>
-        <w:numPr>
-          <w:ilvl w:val="0"/>
-          <w:numId w:val="25"/>
-        </w:numPr>
-      </w:pPr>
-      <w:r>
-        <w:t>Удаление лишнего кода</w:t>
-      </w:r>
-    </w:p>
-    <w:p>
-      <w:pPr>
-        <w:numPr>
-          <w:ilvl w:val="0"/>
-          <w:numId w:val="25"/>
-        </w:numPr>
-      </w:pPr>
-      <w:r>
-        <w:t>Проверка типизации TypeScript</w:t>
-      </w:r>
-    </w:p>
-    <w:p>
-      <w:pPr>
-        <w:numPr>
-          <w:ilvl w:val="0"/>
-          <w:numId w:val="25"/>
-        </w:numPr>
-      </w:pPr>
-      <w:r>
-        <w:t>Оптимизация структуры компонентов</w:t>
-      </w:r>
-    </w:p>
-    <w:p>
-      <w:pPr>
-        <w:rPr>
-          <w:b/>
-          <w:bCs/>
-        </w:rPr>
-      </w:pPr>
-      <w:r>
-        <w:rPr>
-          <w:b/>
-          <w:bCs/>
-        </w:rPr>
-        <w:lastRenderedPageBreak/>
-        <w:t>2 марта — День 15</w:t>
-      </w:r>
-    </w:p>
-    <w:p>
-      <w:r>
-        <w:rPr>
-          <w:b/>
-          <w:bCs/>
-        </w:rPr>
-        <w:t>Документация</w:t>
-      </w:r>
-    </w:p>
-    <w:p>
-      <w:pPr>
-        <w:numPr>
-          <w:ilvl w:val="0"/>
-          <w:numId w:val="26"/>
-        </w:numPr>
-      </w:pPr>
-      <w:r>
-        <w:t>Описание проекта (README.md)</w:t>
-      </w:r>
-    </w:p>
-    <w:p>
-      <w:pPr>
-        <w:numPr>
-          <w:ilvl w:val="0"/>
-          <w:numId w:val="26"/>
-        </w:numPr>
-      </w:pPr>
-      <w:r>
-        <w:t>Инструкция по запуску</w:t>
-      </w:r>
-    </w:p>
-    <w:p>
-      <w:pPr>
-        <w:numPr>
-          <w:ilvl w:val="0"/>
-          <w:numId w:val="26"/>
-        </w:numPr>
-      </w:pPr>
-      <w:r>
-        <w:t>Краткое описание функционала</w:t>
-      </w:r>
-    </w:p>
-    <w:p>
-      <w:pPr>
-        <w:rPr>
-          <w:b/>
-          <w:bCs/>
-        </w:rPr>
-      </w:pPr>
-      <w:r>
-        <w:rPr>
-          <w:b/>
-          <w:bCs/>
-        </w:rPr>
-        <w:t>3 марта — День 16</w:t>
-      </w:r>
-    </w:p>
-    <w:p>
-      <w:r>
-        <w:rPr>
-          <w:b/>
-          <w:bCs/>
-        </w:rPr>
-        <w:t>Финальное тестирование</w:t>
-      </w:r>
-    </w:p>
-    <w:p>
-      <w:pPr>
-        <w:numPr>
-          <w:ilvl w:val="0"/>
-          <w:numId w:val="27"/>
-        </w:numPr>
-      </w:pPr>
-      <w:r>
-        <w:t>Полная проверка проекта</w:t>
-      </w:r>
-    </w:p>
-    <w:p>
-      <w:pPr>
-        <w:numPr>
-          <w:ilvl w:val="0"/>
-          <w:numId w:val="27"/>
-        </w:numPr>
-      </w:pPr>
-      <w:r>
-        <w:t>Проверка всех требований ТЗ</w:t>
-      </w:r>
-    </w:p>
-    <w:p>
-      <w:pPr>
-        <w:numPr>
-          <w:ilvl w:val="0"/>
-          <w:numId w:val="27"/>
-        </w:numPr>
-      </w:pPr>
-      <w:r>
-        <w:t>Подготовка к защите</w:t>
-      </w:r>
-    </w:p>
-    <w:p>
-      <w:pPr>
-        <w:rPr>
-          <w:b/>
-          <w:bCs/>
-        </w:rPr>
-      </w:pPr>
-      <w:r>
-        <w:rPr>
-          <w:b/>
-          <w:bCs/>
-        </w:rPr>
-        <w:t>4 марта — День 17</w:t>
-      </w:r>
-    </w:p>
-    <w:p>
-      <w:r>
-        <w:rPr>
-          <w:b/>
-          <w:bCs/>
-        </w:rPr>
-        <w:t>Резервный день</w:t>
-      </w:r>
-    </w:p>
-    <w:p>
-      <w:pPr>
-        <w:numPr>
-          <w:ilvl w:val="0"/>
-          <w:numId w:val="28"/>
-        </w:numPr>
-      </w:pPr>
-      <w:r>
-        <w:t>Исправление найденных ошибок</w:t>
-      </w:r>
-    </w:p>
-    <w:p>
-      <w:pPr>
-        <w:numPr>
-          <w:ilvl w:val="0"/>
-          <w:numId w:val="28"/>
-        </w:numPr>
-      </w:pPr>
-      <w:r>
-        <w:t>Небольшие улучшения по желанию</w:t>
-      </w:r>
-    </w:p>
-    <w:p>
-      <w:pPr>
-        <w:numPr>
-          <w:ilvl w:val="0"/>
-          <w:numId w:val="28"/>
-        </w:numPr>
-      </w:pPr>
-      <w:r>
-        <w:t>Финальный коммит</w:t>
-      </w:r>
-    </w:p>
-    <w:p>
-      <w:pPr>
-        <w:rPr>
-          <w:lang w:val="ru-RU"/>
-        </w:rPr>
-      </w:pPr>
-      <w:r>
-        <w:t xml:space="preserve"> Коммит: final version before defense</w:t>
-      </w:r>
-    </w:p>
-    <w:p>
-      <w:pPr>
-        <w:rPr>
-          <w:b/>
-          <w:bCs/>
-        </w:rPr>
-      </w:pPr>
-      <w:r>
-        <w:rPr>
-          <w:b/>
-          <w:bCs/>
-        </w:rPr>
-        <w:t>5 марта — День 18</w:t>
-      </w:r>
-    </w:p>
-    <w:p>
-      <w:r>
-        <w:rPr>
-          <w:b/>
-          <w:bCs/>
-        </w:rPr>
-        <w:t>Сдача проекта</w:t>
-      </w:r>
-    </w:p>
-    <w:p>
-      <w:pPr>
-        <w:numPr>
-          <w:ilvl w:val="0"/>
-          <w:numId w:val="29"/>
-        </w:numPr>
-      </w:pPr>
-      <w:r>
-        <w:t>Проверка GitHub</w:t>
-      </w:r>
-    </w:p>
-    <w:p>
-      <w:pPr>
-        <w:numPr>
-          <w:ilvl w:val="0"/>
-          <w:numId w:val="29"/>
-        </w:numPr>
-      </w:pPr>
-      <w:r>
-        <w:t>Подготовка к устной защите</w:t>
-      </w:r>
-    </w:p>
-    <w:p>
-      <w:pPr>
-        <w:numPr>
-          <w:ilvl w:val="0"/>
-          <w:numId w:val="29"/>
-        </w:numPr>
-      </w:pPr>
-      <w:r>
-        <w:t>Повтор основных решений и архитектуры</w:t>
-      </w:r>
-    </w:p>
-    <w:p>
-      <w:pPr>
-        <w:rPr>
-          <w:lang w:val="en-US"/>
-        </w:rPr>
-      </w:pPr>
-    </w:p>
-    <w:p>
-      <w:pPr>
-        <w:rPr>
-          <w:lang w:val="en-US"/>
-        </w:rPr>
-      </w:pPr>
-    </w:p>
-    <w:p>
-      <w:pPr>
-        <w:rPr>
-          <w:lang w:val="en-US"/>
-        </w:rPr>
-      </w:pPr>
-    </w:p>
-    <w:p>
-      <w:pPr>
-        <w:rPr>
-          <w:lang w:val="en-US"/>
-        </w:rPr>
-      </w:pPr>
-      <w:r>
-        <w:rPr>
-          <w:lang w:val="ru-RU"/>
-        </w:rPr>
-        <w:t xml:space="preserve">Я реализовала имитацию </w:t>
-      </w:r>
-      <w:r>
-        <w:t>REST</w:t>
-      </w:r>
-      <w:r>
-        <w:rPr>
-          <w:lang w:val="ru-RU"/>
-        </w:rPr>
-        <w:t xml:space="preserve"> </w:t>
-      </w:r>
-      <w:r>
-        <w:t>API</w:t>
-      </w:r>
-      <w:r>
-        <w:rPr>
-          <w:lang w:val="ru-RU"/>
-        </w:rPr>
-        <w:t xml:space="preserve"> через сервисный слой и использовала </w:t>
-      </w:r>
-      <w:proofErr w:type="spellStart"/>
-      <w:r>
-        <w:t>useEffect</w:t>
-      </w:r>
-      <w:proofErr w:type="spellEnd"/>
-      <w:r>
-        <w:rPr>
-          <w:lang w:val="ru-RU"/>
-        </w:rPr>
-        <w:t xml:space="preserve"> для загрузки данных.</w:t>
-      </w:r>
-    </w:p>
-    <w:p>
-      <w:pPr>
-        <w:rPr>
-          <w:lang w:val="ru-RU"/>
-        </w:rPr>
-      </w:pPr>
-      <w:r>
-        <w:rPr>
-          <w:lang w:val="ru-RU"/>
-        </w:rPr>
-        <w:t xml:space="preserve">Я реализовала глобальное состояние темы через </w:t>
-      </w:r>
-      <w:r>
-        <w:t>Context</w:t>
-      </w:r>
-      <w:r>
-        <w:rPr>
-          <w:lang w:val="ru-RU"/>
-        </w:rPr>
-        <w:t xml:space="preserve"> </w:t>
-      </w:r>
-      <w:r>
-        <w:t>API</w:t>
-      </w:r>
-      <w:r>
-        <w:rPr>
-          <w:lang w:val="ru-RU"/>
-        </w:rPr>
-        <w:t xml:space="preserve">, использовала </w:t>
-      </w:r>
-      <w:proofErr w:type="spellStart"/>
-      <w:r>
-        <w:t>useEffect</w:t>
-      </w:r>
-      <w:proofErr w:type="spellEnd"/>
-      <w:r>
-        <w:rPr>
-          <w:lang w:val="ru-RU"/>
-        </w:rPr>
-        <w:t xml:space="preserve"> для синхронизации с </w:t>
-      </w:r>
-      <w:r>
-        <w:t>DOM</w:t>
-      </w:r>
-      <w:r>
-        <w:rPr>
-          <w:lang w:val="ru-RU"/>
-        </w:rPr>
-        <w:t xml:space="preserve"> и </w:t>
-      </w:r>
-      <w:proofErr w:type="spellStart"/>
-      <w:r>
-        <w:t>localStorage</w:t>
-      </w:r>
-      <w:proofErr w:type="spellEnd"/>
-      <w:r>
-        <w:rPr>
-          <w:lang w:val="ru-RU"/>
-        </w:rPr>
-        <w:t>.</w:t>
       </w:r>
     </w:p>
     <w:sectPr>

</xml_diff>